<commit_message>
reanalysis: rate-based null manuscript + figures/tables/cover/STROBE/PPTX, all reproducible from result files; Makefile
Co-Authored-By: Tatsuki Onishi <bougtoir@gmail.com>
</commit_message>
<xml_diff>
--- a/medical_accident_its_analysis/manuscript/cover_letter.docx
+++ b/medical_accident_its_analysis/manuscript/cover_letter.docx
@@ -3,105 +3,90 @@
 <w:document xmlns:wpc="http://schemas.microsoft.com/office/word/2010/wordprocessingCanvas" xmlns:mo="http://schemas.microsoft.com/office/mac/office/2008/main" xmlns:mc="http://schemas.openxmlformats.org/markup-compatibility/2006" xmlns:mv="urn:schemas-microsoft-com:mac:vml" xmlns:o="urn:schemas-microsoft-com:office:office" xmlns:r="http://schemas.openxmlformats.org/officeDocument/2006/relationships" xmlns:m="http://schemas.openxmlformats.org/officeDocument/2006/math" xmlns:v="urn:schemas-microsoft-com:vml" xmlns:wp14="http://schemas.microsoft.com/office/word/2010/wordprocessingDrawing" xmlns:wp="http://schemas.openxmlformats.org/drawingml/2006/wordprocessingDrawing" xmlns:w10="urn:schemas-microsoft-com:office:word" xmlns:w="http://schemas.openxmlformats.org/wordprocessingml/2006/main" xmlns:w14="http://schemas.microsoft.com/office/word/2010/wordml" xmlns:wpg="http://schemas.microsoft.com/office/word/2010/wordprocessingGroup" xmlns:wpi="http://schemas.microsoft.com/office/word/2010/wordprocessingInk" xmlns:wne="http://schemas.microsoft.com/office/word/2006/wordml" xmlns:wps="http://schemas.microsoft.com/office/word/2010/wordprocessingShape" mc:Ignorable="w14 wp14">
   <w:body>
     <w:p>
-      <w:pPr>
-        <w:jc w:val="right"/>
-      </w:pPr>
       <w:r>
-        <w:rPr>
-          <w:rFonts w:ascii="Times New Roman" w:hAnsi="Times New Roman"/>
-        </w:rPr>
         <w:t>[Date]</w:t>
       </w:r>
     </w:p>
     <w:p/>
     <w:p>
       <w:r>
-        <w:rPr>
-          <w:rFonts w:ascii="Times New Roman" w:hAnsi="Times New Roman"/>
-        </w:rPr>
-        <w:t>Editor-in-Chief</w:t>
-        <w:br/>
-        <w:t>JMA Journal</w:t>
-        <w:br/>
-        <w:t>Japan Medical Association</w:t>
+        <w:t>The Editor-in-Chief</w:t>
+      </w:r>
+    </w:p>
+    <w:p>
+      <w:r>
+        <w:t>[Target Journal]</w:t>
       </w:r>
     </w:p>
     <w:p/>
     <w:p>
       <w:r>
-        <w:rPr>
-          <w:rFonts w:ascii="Times New Roman" w:hAnsi="Times New Roman"/>
-        </w:rPr>
         <w:t>Dear Editor,</w:t>
       </w:r>
     </w:p>
-    <w:p/>
     <w:p>
+      <w:pPr>
+        <w:spacing w:after="160"/>
+      </w:pPr>
       <w:r>
         <w:rPr>
-          <w:rFonts w:ascii="Times New Roman" w:hAnsi="Times New Roman"/>
+          <w:sz w:val="22"/>
         </w:rPr>
-        <w:t>We submit the enclosed manuscript entitled “Medical safety incidents Granger-cause physician workforce decline across 12 specialties in Japan: a vector autoregression analysis” for consideration as an Original Research Article in JMA Journal.</w:t>
+        <w:t>We submit an original research article, "Litigation risk and specialty-level physician workforce in Japan, 2008–2024: a rate-based re-analysis with equivalence testing", for consideration.</w:t>
+      </w:r>
+    </w:p>
+    <w:p>
+      <w:pPr>
+        <w:spacing w:after="160"/>
+      </w:pPr>
+      <w:r>
+        <w:rPr>
+          <w:sz w:val="22"/>
+        </w:rPr>
+        <w:t>Using national primary data for 12 specialties—biennial physician statistics, Supreme Court specialty-specific closed malpractice claims, and the annual medical-institution survey—we test whether litigation risk is associated with decline in the physician workforce and in hospitals offering each specialty. Crucially, we express exposure as a rate (claims per 1,000 physicians) to remove specialty-size confounding, analyse only measured biennial physician observations rather than interpolated annual values, and apply equivalence (TOST) testing.</w:t>
+      </w:r>
+    </w:p>
+    <w:p>
+      <w:pPr>
+        <w:spacing w:after="160"/>
+      </w:pPr>
+      <w:r>
+        <w:rPr>
+          <w:sz w:val="22"/>
+        </w:rPr>
+        <w:t>We find no association between litigation risk and workforce or hospital change; the effect is statistically equivalent to a null within a small, pre-specified margin. The common intuition that physicians avoid high-litigation specialties is not supported. We show that previously reported associations arise from size confounding and from treating interpolated years as independent observations, and we discuss how structural incentives—no-fault obstetric compensation (JOCS-CP) and procedure-based reimbursement—may sustain the specialty workforce.</w:t>
+      </w:r>
+    </w:p>
+    <w:p>
+      <w:pPr>
+        <w:spacing w:after="160"/>
+      </w:pPr>
+      <w:r>
+        <w:rPr>
+          <w:sz w:val="22"/>
+        </w:rPr>
+        <w:t>This manuscript is a substantially rebuilt analysis prepared after external peer review of an earlier version identified count-based modelling and interpolation as structural problems; we have addressed these by moving to rates, measured-only data, equivalence testing, explicit treatment of JOCS-CP, and correction of the Medical Accident Investigation System description. All data and code are openly available and every reported number is reproducible from raw files.</w:t>
+      </w:r>
+    </w:p>
+    <w:p>
+      <w:pPr>
+        <w:spacing w:after="160"/>
+      </w:pPr>
+      <w:r>
+        <w:rPr>
+          <w:sz w:val="22"/>
+        </w:rPr>
+        <w:t>The work is original, not under consideration elsewhere, and all authors approve the submission. We declare no conflicts of interest.</w:t>
       </w:r>
     </w:p>
     <w:p>
       <w:r>
-        <w:rPr>
-          <w:rFonts w:ascii="Times New Roman" w:hAnsi="Times New Roman"/>
-        </w:rPr>
-        <w:t>This study applies vector autoregression and Granger causality testing to two national incident series—mandatory safety reports (2015–2025) and malpractice litigation statistics (2004–2023)—paired with physician and facility counts across 12 specialties. We demonstrate that incident burden carries significant predictive information for subsequent workforce change in 9 of 12 specialties, with bidirectional causality in obstetrics, paediatrics, and general surgery pointing to a self-reinforcing shortage–incident cycle.</w:t>
+        <w:t>Sincerely,</w:t>
       </w:r>
     </w:p>
     <w:p>
       <w:r>
-        <w:rPr>
-          <w:rFonts w:ascii="Times New Roman" w:hAnsi="Times New Roman"/>
-        </w:rPr>
-        <w:t>These findings are timely given the April 2024 implementation of physician work-style reform and ongoing policy debates regarding specialty maldistribution. To our knowledge, this is the first multi-specialty application of Granger causality testing to the relationship between safety incidents and physician workforce dynamics.</w:t>
-      </w:r>
-    </w:p>
-    <w:p>
-      <w:r>
-        <w:rPr>
-          <w:rFonts w:ascii="Times New Roman" w:hAnsi="Times New Roman"/>
-        </w:rPr>
-        <w:t>The manuscript has not been published previously and is not under consideration elsewhere. All data used are publicly available aggregate statistics from national registries. The author declares no conflict of interest.</w:t>
-      </w:r>
-    </w:p>
-    <w:p>
-      <w:r>
-        <w:rPr>
-          <w:rFonts w:ascii="Times New Roman" w:hAnsi="Times New Roman"/>
-        </w:rPr>
-        <w:t>We believe this work will be of interest to the readership of JMA Journal given its direct relevance to Japanese health policy and physician workforce planning.</w:t>
-      </w:r>
-    </w:p>
-    <w:p/>
-    <w:p>
-      <w:r>
-        <w:rPr>
-          <w:rFonts w:ascii="Times New Roman" w:hAnsi="Times New Roman"/>
-        </w:rPr>
-        <w:t>Sincerely,</w:t>
-      </w:r>
-    </w:p>
-    <w:p/>
-    <w:p/>
-    <w:p>
-      <w:r>
-        <w:rPr>
-          <w:rFonts w:ascii="Times New Roman" w:hAnsi="Times New Roman"/>
-          <w:b/>
-        </w:rPr>
-        <w:t>Tatsuki Onishi, MD</w:t>
-      </w:r>
-    </w:p>
-    <w:p>
-      <w:r>
-        <w:rPr>
-          <w:rFonts w:ascii="Times New Roman" w:hAnsi="Times New Roman"/>
-        </w:rPr>
-        <w:t>Corresponding Author</w:t>
+        <w:t>[Corresponding author, on behalf of all authors]</w:t>
       </w:r>
     </w:p>
     <w:sectPr>
@@ -477,12 +462,9 @@
     <w:name w:val="Normal"/>
     <w:qFormat/>
     <w:rsid w:val="00FC693F"/>
-    <w:pPr>
-      <w:spacing w:after="120" w:line="360" w:lineRule="auto"/>
-    </w:pPr>
     <w:rPr>
       <w:rFonts w:ascii="Times New Roman" w:hAnsi="Times New Roman"/>
-      <w:sz w:val="24"/>
+      <w:sz w:val="22"/>
     </w:rPr>
   </w:style>
   <w:style w:type="paragraph" w:styleId="Header">

</xml_diff>